<commit_message>
Spec: align HV-Roman spec with Phase 0 implementation and data
- ड़/ढ़ written d/dh (ladka, padhna), matching common usage
- word-final ें -> ein (mein), ीं -> in (nahin)
- nasalized vowel counts as the left V in medial schwa deletion,
  adopted after measuring rule variants on Dakshina train
- record open decision on medial long vowels (aa/ee/oo): only ~20%
  of real spellings use them; see eval/README.md
- regenerate bundled PDF and Word exports

Co-Authored-By: Claude Opus 5.5 <noreply@anthropic.com>
Claude-Session: https://claude.ai/code/session_01CsWiEdnXrodk6YbDNJFXPs
</commit_message>
<xml_diff>
--- a/HinglishVinglish-plan/word/01-plan-overview.docx
+++ b/HinglishVinglish-plan/word/01-plan-overview.docx
@@ -2153,7 +2153,7 @@
               <w:jc w:val="left"/>
             </w:pPr>
             <w:r>
-              <w:t xml:space="preserve">z f r</w:t>
+              <w:t xml:space="preserve">z f d</w:t>
             </w:r>
           </w:p>
         </w:tc>
@@ -5020,6 +5020,18 @@
       </w:pPr>
       <w:r>
         <w:t xml:space="preserve">☒ Scope: Hindi first, built to extend to other non-Latin scripts.</w:t>
+      </w:r>
+    </w:p>
+    <w:p>
+      <w:pPr>
+        <w:numPr>
+          <w:ilvl w:val="0"/>
+          <w:numId w:val="1007"/>
+        </w:numPr>
+        <w:pStyle w:val="Compact"/>
+      </w:pPr>
+      <w:r>
+        <w:t xml:space="preserve">☐ Open (Oct 26, from Phase 0 data): medial long vowels. HV-Roman 1.0 writes aa / ee / oo (raaja, theek, doodh), but only about 20% of real spellings in Dakshina do. Switching to single vowels (raja, thik, dudh) would raise agreement with people's most common spelling from 34% to 53%, at the cost of hiding vowel length outside the precise view. A change is a major scheme bump, so decide before Phase 3 content is written. Details: eval/README.md.</w:t>
       </w:r>
     </w:p>
     <w:bookmarkEnd w:id="59"/>

</xml_diff>